<commit_message>
updated ms and sm
</commit_message>
<xml_diff>
--- a/LexVar-SM.docx
+++ b/LexVar-SM.docx
@@ -519,7 +519,7 @@
           <w:b/>
           <w:bCs/>
         </w:rPr>
-        <w:t xml:space="preserve">Figure 1</w:t>
+        <w:t xml:space="preserve">Figure S1</w:t>
       </w:r>
       <w:r>
         <w:t xml:space="preserve"> </w:t>
@@ -535,7 +535,7 @@
           <w:b/>
           <w:bCs/>
         </w:rPr>
-        <w:t xml:space="preserve">Table 2</w:t>
+        <w:t xml:space="preserve">Table 1</w:t>
       </w:r>
       <w:r>
         <w:t xml:space="preserve"> </w:t>
@@ -553,7 +553,7 @@
           <wp:inline>
             <wp:extent cx="5943600" cy="3714749"/>
             <wp:effectExtent b="0" l="0" r="0" t="0"/>
-            <wp:docPr descr="Figure 1. Posterior predicted accuracy by condition across both post-labeling time windows. Point ranges reflect posterior means with 89% credible intervals. Jittered dots show raw means for individual participants. Dotted line at 0.5 indicates chance looking." title="" id="34" name="Picture"/>
+            <wp:docPr descr="Figure S1. Posterior predicted accuracy by condition across both post-labeling time windows. Point ranges reflect posterior means with 89% credible intervals. Jittered dots show raw means for individual participants. Dotted line at 0.5 indicates chance looking." title="" id="34" name="Picture"/>
             <a:graphic>
               <a:graphicData uri="http://schemas.openxmlformats.org/drawingml/2006/picture">
                 <pic:pic>
@@ -596,7 +596,7 @@
         <w:pStyle w:val="ImageCaption"/>
       </w:pPr>
       <w:r>
-        <w:t xml:space="preserve">Figure 1. Posterior predicted accuracy by condition across both post-labeling time windows. Point ranges reflect posterior means with 89% credible intervals. Jittered dots show raw means for individual participants. Dotted line at 0.5 indicates chance looking.</w:t>
+        <w:t xml:space="preserve">Figure S1. Posterior predicted accuracy by condition across both post-labeling time windows. Point ranges reflect posterior means with 89% credible intervals. Jittered dots show raw means for individual participants. Dotted line at 0.5 indicates chance looking.</w:t>
       </w:r>
     </w:p>
     <w:p>
@@ -702,7 +702,7 @@
         <w:pStyle w:val="TableCaption"/>
       </w:pPr>
       <w:r>
-        <w:t xml:space="preserve">Table 2. Posterior means and 89% credible intervals for each effect across models.</w:t>
+        <w:t xml:space="preserve">Table S1. Posterior means and 89% credible intervals for each effect across models.</w:t>
       </w:r>
     </w:p>
     <w:tbl>
@@ -710,7 +710,7 @@
         <w:tblStyle w:val="Table"/>
         <w:tblW w:type="auto" w:w="0"/>
         <w:tblLook w:firstRow="1" w:lastRow="0" w:firstColumn="0" w:lastColumn="0" w:noHBand="0" w:noVBand="0" w:val="0020"/>
-        <w:tblCaption w:val="Table 2. Posterior means and 89% credible intervals for each effect across models."/>
+        <w:tblCaption w:val="Table S1. Posterior means and 89% credible intervals for each effect across models."/>
       </w:tblPr>
       <w:tblGrid>
         <w:gridCol w:w="1980"/>
@@ -1253,19 +1253,7 @@
         <w:pStyle w:val="BodyText"/>
       </w:pPr>
       <w:r>
-        <w:t xml:space="preserve">Condition effects were weakly positive but uncertain. For the typical variation condition, the estimated effect was 0.105, SD = 0.134, with a 89% credible interval from -0.109 to 0.319. For the consistent condition, the estimate was 0.117, SD = 0.12, 89% CI [-0.075,</w:t>
-      </w:r>
-      <w:r>
-        <w:t xml:space="preserve"> </w:t>
-      </w:r>
-      <w:r>
-        <w:rPr>
-          <w:rStyle w:val="VerbatimChar"/>
-        </w:rPr>
-        <w:t xml:space="preserve">r</w:t>
-      </w:r>
-      <w:r>
-        <w:t xml:space="preserve">round(stable_ub, 3)`]. The effect of age was small (0.012, SD = 0.069), 89% CI [-0.099, 0.122].</w:t>
+        <w:t xml:space="preserve">Condition effects were weakly positive but uncertain. For the typical variation condition, the estimated effect was 0.105, SD = 0.134, with a 89% credible interval from -0.109 to 0.319. For the consistent condition, the estimate was 0.117, SD = 0.12, 89% CI [-0.075, 0.309]. The effect of age was small (0.012, SD = 0.069), 89% CI [-0.099, 0.122].</w:t>
       </w:r>
     </w:p>
     <w:p>
@@ -1277,13 +1265,13 @@
       </w:r>
     </w:p>
     <w:bookmarkEnd w:id="36"/>
-    <w:bookmarkStart w:id="71" w:name="window-effects"/>
+    <w:bookmarkStart w:id="47" w:name="lwl-window-effects"/>
     <w:p>
       <w:pPr>
         <w:pStyle w:val="Heading1"/>
       </w:pPr>
       <w:r>
-        <w:t xml:space="preserve">2. Window effects</w:t>
+        <w:t xml:space="preserve">2. LWL window effects</w:t>
       </w:r>
     </w:p>
     <w:bookmarkStart w:id="37" w:name="X184e3e3478f17ede81813de3834d75ff7f0546f"/>
@@ -1312,7 +1300,7 @@
       </w:r>
     </w:p>
     <w:bookmarkEnd w:id="37"/>
-    <w:bookmarkStart w:id="39" w:name="linear-mixed-effects-regression-analyses"/>
+    <w:bookmarkStart w:id="42" w:name="linear-mixed-effects-regression-analyses"/>
     <w:p>
       <w:pPr>
         <w:pStyle w:val="Heading2"/>
@@ -1368,7 +1356,7 @@
           <w:i/>
           <w:iCs/>
         </w:rPr>
-        <w:t xml:space="preserve">OR</w:t>
+        <w:t xml:space="preserve">β</w:t>
       </w:r>
       <w:r>
         <w:t xml:space="preserve"> </w:t>
@@ -1441,23 +1429,21 @@
       <w:r>
         <w:t xml:space="preserve">= 0.765).</w:t>
       </w:r>
-    </w:p>
-    <w:bookmarkEnd w:id="39"/>
-    <w:bookmarkStart w:id="43" w:name="cluster-based-permutation-analyses"/>
-    <w:p>
-      <w:pPr>
-        <w:pStyle w:val="Heading2"/>
-      </w:pPr>
-      <w:r>
-        <w:t xml:space="preserve">2.3 Cluster-based permutation analyses</w:t>
-      </w:r>
-    </w:p>
-    <w:p>
-      <w:pPr>
-        <w:pStyle w:val="FirstParagraph"/>
-      </w:pPr>
-      <w:r>
-        <w:t xml:space="preserve">A cluster-based permutation test identified a marginal cluster from 350 to 400ms (AUC = 2.92), but this cluster did not reach significance compared to the permutation-based null distribution (p = 0.997), suggesting at most a weak and transient effect of condition.</w:t>
+      <w:r>
+        <w:t xml:space="preserve"> </w:t>
+      </w:r>
+      <w:r>
+        <w:rPr>
+          <w:b/>
+          <w:bCs/>
+        </w:rPr>
+        <w:t xml:space="preserve">Figure S2</w:t>
+      </w:r>
+      <w:r>
+        <w:t xml:space="preserve"> </w:t>
+      </w:r>
+      <w:r>
+        <w:t xml:space="preserve">shows model-predicted accuracy across conditions, separately for the two post-labeling windows.</w:t>
       </w:r>
     </w:p>
     <w:p>
@@ -1469,18 +1455,18 @@
           <wp:inline>
             <wp:extent cx="5943600" cy="3714749"/>
             <wp:effectExtent b="0" l="0" r="0" t="0"/>
-            <wp:docPr descr="Figure 2: Timecourse of participants’ looks during test trials with shaded standard error regions. The black dashed line at 0.5 represents chance looking. The gray shaded regions indicate the critical analysis windows (300-2000ms) following target word onset." title="" id="41" name="Picture"/>
+            <wp:docPr descr="Figure S2. Model-predicted accuracy by condition across both post-labeling windows. Point ranges reflect estimated marginal means with 95% confidence intervals. Jittered dots show raw means for individual participants. The dashed line at 0.50 indicates chance performance." title="" id="40" name="Picture"/>
             <a:graphic>
               <a:graphicData uri="http://schemas.openxmlformats.org/drawingml/2006/picture">
                 <pic:pic>
                   <pic:nvPicPr>
-                    <pic:cNvPr descr="FigureS2.png" id="42" name="Picture"/>
+                    <pic:cNvPr descr="FigureS2.png" id="41" name="Picture"/>
                     <pic:cNvPicPr>
                       <a:picLocks noChangeArrowheads="1" noChangeAspect="1"/>
                     </pic:cNvPicPr>
                   </pic:nvPicPr>
                   <pic:blipFill>
-                    <a:blip r:embed="rId40"/>
+                    <a:blip r:embed="rId39"/>
                     <a:stretch>
                       <a:fillRect/>
                     </a:stretch>
@@ -1512,26 +1498,17 @@
         <w:pStyle w:val="ImageCaption"/>
       </w:pPr>
       <w:r>
-        <w:t xml:space="preserve">Figure 2: Timecourse of participants’ looks during test trials with shaded standard error regions. The black dashed line at 0.5 represents chance looking. The gray shaded regions indicate the critical analysis windows (300-2000ms) following target word onset.</w:t>
-      </w:r>
-    </w:p>
-    <w:bookmarkEnd w:id="43"/>
-    <w:bookmarkStart w:id="70" w:name="X766ac349de9df7b6c7c4b96c9a4fd67a2087b79"/>
+        <w:t xml:space="preserve">Figure S2. Model-predicted accuracy by condition across both post-labeling windows. Point ranges reflect estimated marginal means with 95% confidence intervals. Jittered dots show raw means for individual participants. The dashed line at 0.50 indicates chance performance.</w:t>
+      </w:r>
+    </w:p>
+    <w:bookmarkEnd w:id="42"/>
+    <w:bookmarkStart w:id="46" w:name="cluster-based-permutation-analyses"/>
     <w:p>
       <w:pPr>
         <w:pStyle w:val="Heading2"/>
       </w:pPr>
       <w:r>
-        <w:t xml:space="preserve">2.4 Moment-by-moment attention measured by pupil size synchrony</w:t>
-      </w:r>
-    </w:p>
-    <w:bookmarkStart w:id="69" w:name="X29eb9cdab632aadf01b598ee0fac2a0355befc5"/>
-    <w:p>
-      <w:pPr>
-        <w:pStyle w:val="Heading3"/>
-      </w:pPr>
-      <w:r>
-        <w:t xml:space="preserve">2.4.1 Comparing pupil size synchrony across conditions</w:t>
+        <w:t xml:space="preserve">2.3 Cluster-based permutation analyses</w:t>
       </w:r>
     </w:p>
     <w:p>
@@ -1539,118 +1516,53 @@
         <w:pStyle w:val="FirstParagraph"/>
       </w:pPr>
       <w:r>
-        <w:t xml:space="preserve">Following</w:t>
-      </w:r>
-      <w:r>
-        <w:t xml:space="preserve"> </w:t>
-      </w:r>
-      <w:r>
-        <w:t xml:space="preserve">Nencheva et al. (</w:t>
-      </w:r>
-      <w:hyperlink w:anchor="ref-nencheva2021moment">
+        <w:t xml:space="preserve">A cluster-based permutation test</w:t>
+      </w:r>
+      <w:r>
+        <w:t xml:space="preserve"> </w:t>
+      </w:r>
+      <w:r>
+        <w:t xml:space="preserve">(</w:t>
+      </w:r>
+      <w:hyperlink w:anchor="ref-maris2007nonparametric">
         <w:r>
           <w:rPr>
             <w:rStyle w:val="Hyperlink"/>
           </w:rPr>
-          <w:t xml:space="preserve">2021</w:t>
+          <w:t xml:space="preserve">Maris &amp; Oostenveld, 2007</w:t>
         </w:r>
       </w:hyperlink>
       <w:r>
         <w:t xml:space="preserve">)</w:t>
       </w:r>
       <w:r>
-        <w:t xml:space="preserve">, we used dynamic time-warping distance [DTW;</w:t>
-      </w:r>
-      <w:r>
-        <w:t xml:space="preserve"> </w:t>
-      </w:r>
-      <w:r>
-        <w:t xml:space="preserve">Tormene et al. (</w:t>
-      </w:r>
-      <w:hyperlink w:anchor="ref-tormene2009matching">
-        <w:r>
-          <w:rPr>
-            <w:rStyle w:val="Hyperlink"/>
-          </w:rPr>
-          <w:t xml:space="preserve">2009</w:t>
-        </w:r>
-      </w:hyperlink>
-      <w:r>
-        <w:t xml:space="preserve">)</w:t>
-      </w:r>
-      <w:r>
-        <w:t xml:space="preserve">] to quantify the temporal alignment of participants’ pupil responses when hearing individual exposure sentences or words (normalized for duration). This DTW measure quantifies the dissimilarity between two time series of pupil fluctuations. To transform these values into synchrony scores, we subtracted DTW distance scores from the maximum distance between two participants on each trial. To compare pupil size synchrony across conditions, we computed pairwise synchrony scores for all possible pairs of participants (for each exposure sentence or word per condition).</w:t>
-      </w:r>
-    </w:p>
-    <w:p>
-      <w:pPr>
-        <w:pStyle w:val="BodyText"/>
-      </w:pPr>
-      <w:r>
-        <w:t xml:space="preserve">A one-way ANOVA revealed a significant main effect of condition on pupil size synchrony [F(2, 261.1966453) = 4,</w:t>
-      </w:r>
-      <w:r>
-        <w:t xml:space="preserve"> </w:t>
-      </w:r>
-      <w:r>
-        <w:rPr>
-          <w:i/>
-          <w:iCs/>
-        </w:rPr>
-        <w:t xml:space="preserve">p</w:t>
-      </w:r>
-      <w:r>
-        <w:t xml:space="preserve"> </w:t>
-      </w:r>
-      <w:r>
-        <w:t xml:space="preserve">= 0.0195].</w:t>
-      </w:r>
-    </w:p>
-    <w:p>
-      <w:pPr>
-        <w:pStyle w:val="BodyText"/>
-      </w:pPr>
-      <w:r>
-        <w:t xml:space="preserve">Follow-up pairwise comparisons using Tukey’s HSD correction indicated that pupil size synchrony was significantly higher in the typical variation condition compared to the atypical variation condition (ΔM = -0.28,</w:t>
-      </w:r>
-      <w:r>
-        <w:t xml:space="preserve"> </w:t>
-      </w:r>
-      <w:r>
-        <w:rPr>
-          <w:i/>
-          <w:iCs/>
-        </w:rPr>
-        <w:t xml:space="preserve">p</w:t>
-      </w:r>
-      <w:r>
-        <w:t xml:space="preserve"> </w:t>
-      </w:r>
-      <w:r>
-        <w:t xml:space="preserve">= 0.024, Cohen’s d = -0.37). No other pairwise comparisons were statistically significant (_p_s &gt; 0.05).</w:t>
-      </w:r>
-    </w:p>
-    <w:p>
-      <w:pPr>
-        <w:pStyle w:val="BodyText"/>
+        <w:t xml:space="preserve"> </w:t>
+      </w:r>
+      <w:r>
+        <w:t xml:space="preserve">identified a marginal cluster from 350 to 400ms (AUC = 2.92), but this cluster did not reach significance compared to the permutation-based null distribution (p = 0.997), suggesting at most a weak and transient effect of condition.</w:t>
+      </w:r>
+    </w:p>
+    <w:p>
+      <w:pPr>
+        <w:pStyle w:val="CaptionedFigure"/>
       </w:pPr>
       <w:r>
         <w:drawing>
           <wp:inline>
-            <wp:extent cx="5943600" cy="5943600"/>
+            <wp:extent cx="5943600" cy="3714749"/>
             <wp:effectExtent b="0" l="0" r="0" t="0"/>
-            <wp:docPr descr="" title="" id="45" name="Picture"/>
+            <wp:docPr descr="Figure S3: Timecourse of participants’ looks during test trials with shaded standard error regions. The black dashed line at 0.5 represents chance looking. The gray shaded regions indicate the critical analysis windows (300-2000ms) following target word onset." title="" id="44" name="Picture"/>
             <a:graphic>
               <a:graphicData uri="http://schemas.openxmlformats.org/drawingml/2006/picture">
                 <pic:pic>
                   <pic:nvPicPr>
-                    <pic:cNvPr descr="LexVar-SM_files/figure-docx/pupillometry-fig-1.png" id="46" name="Picture"/>
+                    <pic:cNvPr descr="FigureS3.png" id="45" name="Picture"/>
                     <pic:cNvPicPr>
                       <a:picLocks noChangeArrowheads="1" noChangeAspect="1"/>
                     </pic:cNvPicPr>
                   </pic:nvPicPr>
                   <pic:blipFill>
-                    <a:blip r:embed="rId44"/>
+                    <a:blip r:embed="rId43"/>
                     <a:stretch>
                       <a:fillRect/>
                     </a:stretch>
@@ -1658,7 +1570,7 @@
                   <pic:spPr bwMode="auto">
                     <a:xfrm>
                       <a:off x="0" y="0"/>
-                      <a:ext cx="5943600" cy="5943600"/>
+                      <a:ext cx="5943600" cy="3714749"/>
                     </a:xfrm>
                     <a:prstGeom prst="rect">
                       <a:avLst/>
@@ -1679,25 +1591,52 @@
     </w:p>
     <w:p>
       <w:pPr>
-        <w:pStyle w:val="BodyText"/>
+        <w:pStyle w:val="ImageCaption"/>
+      </w:pPr>
+      <w:r>
+        <w:t xml:space="preserve">Figure S3: Timecourse of participants’ looks during test trials with shaded standard error regions. The black dashed line at 0.5 represents chance looking. The gray shaded regions indicate the critical analysis windows (300-2000ms) following target word onset.</w:t>
+      </w:r>
+    </w:p>
+    <w:bookmarkEnd w:id="46"/>
+    <w:bookmarkEnd w:id="47"/>
+    <w:bookmarkStart w:id="54" w:name="alternative-pupillometry-analyses"/>
+    <w:p>
+      <w:pPr>
+        <w:pStyle w:val="Heading1"/>
+      </w:pPr>
+      <w:r>
+        <w:t xml:space="preserve">3. Alternative pupillometry analyses</w:t>
+      </w:r>
+    </w:p>
+    <w:p>
+      <w:pPr>
+        <w:pStyle w:val="FirstParagraph"/>
+      </w:pPr>
+      <w:r>
+        <w:t xml:space="preserve">Our main analyses compared toddlers’ pupil size synchrony during the two types of exposure sentences that differed between conditions. We include below effects taking into account all four types of exposure sentences, in which synchrony is highest for the consistent condition.</w:t>
+      </w:r>
+    </w:p>
+    <w:p>
+      <w:pPr>
+        <w:pStyle w:val="CaptionedFigure"/>
       </w:pPr>
       <w:r>
         <w:drawing>
           <wp:inline>
-            <wp:extent cx="5943600" cy="5943600"/>
+            <wp:extent cx="5943600" cy="3714749"/>
             <wp:effectExtent b="0" l="0" r="0" t="0"/>
-            <wp:docPr descr="" title="" id="48" name="Picture"/>
+            <wp:docPr descr="Figure S4: Model-predicted sentence-level mean pupil size synchrony (z-scored) across conditions for all exposure sentences with 95% confidence intervals. Jittered points represent participant means." title="" id="49" name="Picture"/>
             <a:graphic>
               <a:graphicData uri="http://schemas.openxmlformats.org/drawingml/2006/picture">
                 <pic:pic>
                   <pic:nvPicPr>
-                    <pic:cNvPr descr="LexVar-SM_files/figure-docx/pupillometry-fig-2.png" id="49" name="Picture"/>
+                    <pic:cNvPr descr="FigureS4.png" id="50" name="Picture"/>
                     <pic:cNvPicPr>
                       <a:picLocks noChangeArrowheads="1" noChangeAspect="1"/>
                     </pic:cNvPicPr>
                   </pic:nvPicPr>
                   <pic:blipFill>
-                    <a:blip r:embed="rId47"/>
+                    <a:blip r:embed="rId48"/>
                     <a:stretch>
                       <a:fillRect/>
                     </a:stretch>
@@ -1705,7 +1644,7 @@
                   <pic:spPr bwMode="auto">
                     <a:xfrm>
                       <a:off x="0" y="0"/>
-                      <a:ext cx="5943600" cy="5943600"/>
+                      <a:ext cx="5943600" cy="3714749"/>
                     </a:xfrm>
                     <a:prstGeom prst="rect">
                       <a:avLst/>
@@ -1726,90 +1665,115 @@
     </w:p>
     <w:p>
       <w:pPr>
-        <w:pStyle w:val="SourceCode"/>
-      </w:pPr>
-      <w:r>
-        <w:rPr>
-          <w:rStyle w:val="VerbatimChar"/>
-        </w:rPr>
-        <w:t xml:space="preserve">Data: combined_data</w:t>
-      </w:r>
-      <w:r>
-        <w:br/>
-      </w:r>
-      <w:r>
-        <w:rPr>
-          <w:rStyle w:val="VerbatimChar"/>
-        </w:rPr>
-        <w:t xml:space="preserve">Models:</w:t>
-      </w:r>
-      <w:r>
-        <w:br/>
-      </w:r>
-      <w:r>
-        <w:rPr>
-          <w:rStyle w:val="VerbatimChar"/>
-        </w:rPr>
-        <w:t xml:space="preserve">m_null: acc_z ~ condition + (1 | pid)</w:t>
-      </w:r>
-      <w:r>
-        <w:br/>
-      </w:r>
-      <w:r>
-        <w:rPr>
-          <w:rStyle w:val="VerbatimChar"/>
-        </w:rPr>
-        <w:t xml:space="preserve">m_sync: acc_z ~ condition + sync_z + (1 | pid)</w:t>
-      </w:r>
-      <w:r>
-        <w:br/>
-      </w:r>
-      <w:r>
-        <w:rPr>
-          <w:rStyle w:val="VerbatimChar"/>
-        </w:rPr>
-        <w:t xml:space="preserve">       npar    AIC    BIC  logLik deviance  Chisq Df Pr(&gt;Chisq)</w:t>
-      </w:r>
-      <w:r>
-        <w:br/>
-      </w:r>
-      <w:r>
-        <w:rPr>
-          <w:rStyle w:val="VerbatimChar"/>
-        </w:rPr>
-        <w:t xml:space="preserve">m_null    5 899.94 918.69 -444.97   889.94                     </w:t>
-      </w:r>
-      <w:r>
-        <w:br/>
-      </w:r>
-      <w:r>
-        <w:rPr>
-          <w:rStyle w:val="VerbatimChar"/>
-        </w:rPr>
-        <w:t xml:space="preserve">m_sync    6 901.76 924.26 -444.88   889.76 0.1821  1     0.6695</w:t>
-      </w:r>
-    </w:p>
-    <w:p>
-      <w:pPr>
-        <w:pStyle w:val="FirstParagraph"/>
+        <w:pStyle w:val="ImageCaption"/>
+      </w:pPr>
+      <w:r>
+        <w:t xml:space="preserve">Figure S4: Model-predicted sentence-level mean pupil size synchrony (z-scored) across conditions for all exposure sentences with 95% confidence intervals. Jittered points represent participant means.</w:t>
+      </w:r>
+    </w:p>
+    <w:p>
+      <w:pPr>
+        <w:pStyle w:val="BodyText"/>
+      </w:pPr>
+      <w:r>
+        <w:t xml:space="preserve">A one-way ANOVA revealed a significant main effect of condition on pupil size synchrony [F(2, 283.3018605) = 20.96,</w:t>
+      </w:r>
+      <w:r>
+        <w:t xml:space="preserve"> </w:t>
+      </w:r>
+      <w:r>
+        <w:rPr>
+          <w:i/>
+          <w:iCs/>
+        </w:rPr>
+        <w:t xml:space="preserve">p</w:t>
+      </w:r>
+      <w:r>
+        <w:t xml:space="preserve"> </w:t>
+      </w:r>
+      <w:r>
+        <w:t xml:space="preserve">= 3.24e-09].</w:t>
+      </w:r>
+    </w:p>
+    <w:p>
+      <w:pPr>
+        <w:pStyle w:val="BodyText"/>
+      </w:pPr>
+      <w:r>
+        <w:t xml:space="preserve">Follow-up pairwise comparisons using Tukey’s HSD correction indicated that pupil size synchrony was significantly higher in the consistent condition compared to the typical variation (ΔM = -0.69,</w:t>
+      </w:r>
+      <w:r>
+        <w:t xml:space="preserve"> </w:t>
+      </w:r>
+      <w:r>
+        <w:rPr>
+          <w:i/>
+          <w:iCs/>
+        </w:rPr>
+        <w:t xml:space="preserve">p</w:t>
+      </w:r>
+      <w:r>
+        <w:t xml:space="preserve"> </w:t>
+      </w:r>
+      <w:r>
+        <w:t xml:space="preserve">= 0, Cohen’s d = -0.83) and atypical variation conditions (ΔM = 0.53,</w:t>
+      </w:r>
+      <w:r>
+        <w:t xml:space="preserve"> </w:t>
+      </w:r>
+      <w:r>
+        <w:rPr>
+          <w:i/>
+          <w:iCs/>
+        </w:rPr>
+        <w:t xml:space="preserve">p</w:t>
+      </w:r>
+      <w:r>
+        <w:t xml:space="preserve"> </w:t>
+      </w:r>
+      <w:r>
+        <w:t xml:space="preserve">= 0, Cohen’s d = 0.64). No other pairwise comparisons were statistically significant (</w:t>
+      </w:r>
+      <w:r>
+        <w:rPr>
+          <w:i/>
+          <w:iCs/>
+        </w:rPr>
+        <w:t xml:space="preserve">p</w:t>
+      </w:r>
+      <w:r>
+        <w:t xml:space="preserve">s &gt; 0.05).</w:t>
+      </w:r>
+    </w:p>
+    <w:p>
+      <w:pPr>
+        <w:pStyle w:val="BodyText"/>
+      </w:pPr>
+      <w:r>
+        <w:t xml:space="preserve">Model diagnostics indicated mild deviations from linearity and homogeneity of variance, as well as a cluster of influential observations, so results should be interpreted with caution.</w:t>
+      </w:r>
+    </w:p>
+    <w:p>
+      <w:pPr>
+        <w:pStyle w:val="CaptionedFigure"/>
       </w:pPr>
       <w:r>
         <w:drawing>
           <wp:inline>
-            <wp:extent cx="5943600" cy="5943600"/>
+            <wp:extent cx="5943600" cy="3714749"/>
             <wp:effectExtent b="0" l="0" r="0" t="0"/>
-            <wp:docPr descr="" title="" id="51" name="Picture"/>
+            <wp:docPr descr="Figure S5: Model-predicted mean word-level pupil size synchrony (z-scored) across conditions with 95% confidence intervals. Jittered points represent participant means." title="" id="52" name="Picture"/>
             <a:graphic>
               <a:graphicData uri="http://schemas.openxmlformats.org/drawingml/2006/picture">
                 <pic:pic>
                   <pic:nvPicPr>
-                    <pic:cNvPr descr="LexVar-SM_files/figure-docx/pupillometry-word-level-1.png" id="52" name="Picture"/>
+                    <pic:cNvPr descr="FigureS5.png" id="53" name="Picture"/>
                     <pic:cNvPicPr>
                       <a:picLocks noChangeArrowheads="1" noChangeAspect="1"/>
                     </pic:cNvPicPr>
                   </pic:nvPicPr>
                   <pic:blipFill>
-                    <a:blip r:embed="rId50"/>
+                    <a:blip r:embed="rId51"/>
                     <a:stretch>
                       <a:fillRect/>
                     </a:stretch>
@@ -1817,7 +1781,7 @@
                   <pic:spPr bwMode="auto">
                     <a:xfrm>
                       <a:off x="0" y="0"/>
-                      <a:ext cx="5943600" cy="5943600"/>
+                      <a:ext cx="5943600" cy="3714749"/>
                     </a:xfrm>
                     <a:prstGeom prst="rect">
                       <a:avLst/>
@@ -1838,57 +1802,18 @@
     </w:p>
     <w:p>
       <w:pPr>
+        <w:pStyle w:val="ImageCaption"/>
+      </w:pPr>
+      <w:r>
+        <w:t xml:space="preserve">Figure S5: Model-predicted mean word-level pupil size synchrony (z-scored) across conditions with 95% confidence intervals. Jittered points represent participant means.</w:t>
+      </w:r>
+    </w:p>
+    <w:p>
+      <w:pPr>
         <w:pStyle w:val="BodyText"/>
       </w:pPr>
       <w:r>
-        <w:drawing>
-          <wp:inline>
-            <wp:extent cx="5943600" cy="5943600"/>
-            <wp:effectExtent b="0" l="0" r="0" t="0"/>
-            <wp:docPr descr="" title="" id="54" name="Picture"/>
-            <a:graphic>
-              <a:graphicData uri="http://schemas.openxmlformats.org/drawingml/2006/picture">
-                <pic:pic>
-                  <pic:nvPicPr>
-                    <pic:cNvPr descr="LexVar-SM_files/figure-docx/pupillometry-word-level-2.png" id="55" name="Picture"/>
-                    <pic:cNvPicPr>
-                      <a:picLocks noChangeArrowheads="1" noChangeAspect="1"/>
-                    </pic:cNvPicPr>
-                  </pic:nvPicPr>
-                  <pic:blipFill>
-                    <a:blip r:embed="rId53"/>
-                    <a:stretch>
-                      <a:fillRect/>
-                    </a:stretch>
-                  </pic:blipFill>
-                  <pic:spPr bwMode="auto">
-                    <a:xfrm>
-                      <a:off x="0" y="0"/>
-                      <a:ext cx="5943600" cy="5943600"/>
-                    </a:xfrm>
-                    <a:prstGeom prst="rect">
-                      <a:avLst/>
-                    </a:prstGeom>
-                    <a:noFill/>
-                    <a:ln w="9525">
-                      <a:noFill/>
-                      <a:headEnd/>
-                      <a:tailEnd/>
-                    </a:ln>
-                  </pic:spPr>
-                </pic:pic>
-              </a:graphicData>
-            </a:graphic>
-          </wp:inline>
-        </w:drawing>
-      </w:r>
-    </w:p>
-    <w:p>
-      <w:pPr>
-        <w:pStyle w:val="BodyText"/>
-      </w:pPr>
-      <w:r>
-        <w:t xml:space="preserve">We also examined pupil size synchrony at the word level. A one-way ANOVA revealed a significant main effect of condition on pupil size synchrony [</w:t>
+        <w:t xml:space="preserve">We also examined pupil size synchrony at the word level, focusing on the same exposure sentences as the main text. A one-way ANOVA revealed a significant main effect of condition on pupil size synchrony [</w:t>
       </w:r>
       <w:r>
         <w:rPr>
@@ -1898,7 +1823,7 @@
         <w:t xml:space="preserve">F</w:t>
       </w:r>
       <w:r>
-        <w:t xml:space="preserve">(2, 314) = 4.43,</w:t>
+        <w:t xml:space="preserve">(2, 314) = 20.22,</w:t>
       </w:r>
       <w:r>
         <w:t xml:space="preserve"> </w:t>
@@ -1914,7 +1839,7 @@
         <w:t xml:space="preserve"> </w:t>
       </w:r>
       <w:r>
-        <w:t xml:space="preserve">= 0.013]. Follow-up pairwise comparisons using Tukey’s HSD correction indicated that, relative to the consistent condition, pupil size synchrony was significantly lower in the atypical variation condition condition (ΔM = 0.21,</w:t>
+        <w:t xml:space="preserve">= 0.000]. Follow-up pairwise comparisons using Tukey’s HSD correction indicated that, relative to the consistent condition, pupil size synchrony was significantly higher in the atypical variation condition condition (ΔM = 0.52,</w:t>
       </w:r>
       <w:r>
         <w:t xml:space="preserve"> </w:t>
@@ -1930,7 +1855,7 @@
         <w:t xml:space="preserve"> </w:t>
       </w:r>
       <w:r>
-        <w:t xml:space="preserve">= 0.247, Cohen’s</w:t>
+        <w:t xml:space="preserve">= 0, Cohen’s</w:t>
       </w:r>
       <w:r>
         <w:t xml:space="preserve"> </w:t>
@@ -1946,7 +1871,7 @@
         <w:t xml:space="preserve"> </w:t>
       </w:r>
       <w:r>
-        <w:t xml:space="preserve">= 0.22) and marginally lower in the typical variation condition (ΔM = -0.18,</w:t>
+        <w:t xml:space="preserve">= 0.82) and descriptively higher (but not significantly higher) in the typical variation condition (ΔM = 0.11,</w:t>
       </w:r>
       <w:r>
         <w:t xml:space="preserve"> </w:t>
@@ -1962,7 +1887,7 @@
         <w:t xml:space="preserve"> </w:t>
       </w:r>
       <w:r>
-        <w:t xml:space="preserve">= 0.371, Cohen’s</w:t>
+        <w:t xml:space="preserve">= 0.433, Cohen’s</w:t>
       </w:r>
       <w:r>
         <w:t xml:space="preserve"> </w:t>
@@ -1978,7 +1903,10 @@
         <w:t xml:space="preserve"> </w:t>
       </w:r>
       <w:r>
-        <w:t xml:space="preserve">= 0.19). There was no difference in synchrony between the atypical variation condition and the typical variation condition (</w:t>
+        <w:t xml:space="preserve">= -0.17). Sychrony was also significantly higher in the atypical variation condition relative to the typical variation condition (ΔM = -0.41,</w:t>
+      </w:r>
+      <w:r>
+        <w:t xml:space="preserve"> </w:t>
       </w:r>
       <w:r>
         <w:rPr>
@@ -1991,26 +1919,7 @@
         <w:t xml:space="preserve"> </w:t>
       </w:r>
       <w:r>
-        <w:t xml:space="preserve">&gt; 0.05).</w:t>
-      </w:r>
-    </w:p>
-    <w:bookmarkStart w:id="68" w:name="refs"/>
-    <w:bookmarkStart w:id="57" w:name="ref-lme4"/>
-    <w:p>
-      <w:pPr>
-        <w:pStyle w:val="Bibliography"/>
-      </w:pPr>
-      <w:r>
-        <w:t xml:space="preserve">Bates, D., Mächler, M., Bolker, B., &amp; Walker, S. (2015). Fitting linear mixed-effects models using</w:t>
-      </w:r>
-      <w:r>
-        <w:t xml:space="preserve"> </w:t>
-      </w:r>
-      <w:r>
-        <w:t xml:space="preserve">lme4</w:t>
-      </w:r>
-      <w:r>
-        <w:t xml:space="preserve">.</w:t>
+        <w:t xml:space="preserve">= 0, Cohen’s</w:t>
       </w:r>
       <w:r>
         <w:t xml:space="preserve"> </w:t>
@@ -2020,10 +1929,42 @@
           <w:i/>
           <w:iCs/>
         </w:rPr>
-        <w:t xml:space="preserve">Journal of Statistical Software</w:t>
-      </w:r>
-      <w:r>
-        <w:t xml:space="preserve">,</w:t>
+        <w:t xml:space="preserve">d</w:t>
+      </w:r>
+      <w:r>
+        <w:t xml:space="preserve"> </w:t>
+      </w:r>
+      <w:r>
+        <w:t xml:space="preserve">= 0.65).</w:t>
+      </w:r>
+    </w:p>
+    <w:bookmarkEnd w:id="54"/>
+    <w:bookmarkStart w:id="68" w:name="references"/>
+    <w:p>
+      <w:pPr>
+        <w:pStyle w:val="Heading1"/>
+      </w:pPr>
+      <w:r>
+        <w:t xml:space="preserve">4. References</w:t>
+      </w:r>
+    </w:p>
+    <w:bookmarkStart w:id="67" w:name="refs"/>
+    <w:bookmarkStart w:id="56" w:name="ref-lme4"/>
+    <w:p>
+      <w:pPr>
+        <w:pStyle w:val="Bibliography"/>
+      </w:pPr>
+      <w:r>
+        <w:t xml:space="preserve">Bates, D., Mächler, M., Bolker, B., &amp; Walker, S. (2015). Fitting linear mixed-effects models using</w:t>
+      </w:r>
+      <w:r>
+        <w:t xml:space="preserve"> </w:t>
+      </w:r>
+      <w:r>
+        <w:t xml:space="preserve">lme4</w:t>
+      </w:r>
+      <w:r>
+        <w:t xml:space="preserve">.</w:t>
       </w:r>
       <w:r>
         <w:t xml:space="preserve"> </w:t>
@@ -2033,6 +1974,19 @@
           <w:i/>
           <w:iCs/>
         </w:rPr>
+        <w:t xml:space="preserve">Journal of Statistical Software</w:t>
+      </w:r>
+      <w:r>
+        <w:t xml:space="preserve">,</w:t>
+      </w:r>
+      <w:r>
+        <w:t xml:space="preserve"> </w:t>
+      </w:r>
+      <w:r>
+        <w:rPr>
+          <w:i/>
+          <w:iCs/>
+        </w:rPr>
         <w:t xml:space="preserve">67</w:t>
       </w:r>
       <w:r>
@@ -2041,7 +1995,7 @@
       <w:r>
         <w:t xml:space="preserve"> </w:t>
       </w:r>
-      <w:hyperlink r:id="rId56">
+      <w:hyperlink r:id="rId55">
         <w:r>
           <w:rPr>
             <w:rStyle w:val="Hyperlink"/>
@@ -2050,8 +2004,8 @@
         </w:r>
       </w:hyperlink>
     </w:p>
-    <w:bookmarkEnd w:id="57"/>
-    <w:bookmarkStart w:id="58" w:name="ref-brms"/>
+    <w:bookmarkEnd w:id="56"/>
+    <w:bookmarkStart w:id="57" w:name="ref-brms"/>
     <w:p>
       <w:pPr>
         <w:pStyle w:val="Bibliography"/>
@@ -2086,8 +2040,8 @@
         <w:t xml:space="preserve">, 1–28.</w:t>
       </w:r>
     </w:p>
-    <w:bookmarkEnd w:id="58"/>
-    <w:bookmarkStart w:id="59" w:name="ref-cribari2010beta"/>
+    <w:bookmarkEnd w:id="57"/>
+    <w:bookmarkStart w:id="58" w:name="ref-cribari2010beta"/>
     <w:p>
       <w:pPr>
         <w:pStyle w:val="Bibliography"/>
@@ -2122,8 +2076,8 @@
         <w:t xml:space="preserve">(1), 1–24.</w:t>
       </w:r>
     </w:p>
-    <w:bookmarkEnd w:id="59"/>
-    <w:bookmarkStart w:id="60" w:name="ref-fernald2008looking"/>
+    <w:bookmarkEnd w:id="58"/>
+    <w:bookmarkStart w:id="59" w:name="ref-fernald2008looking"/>
     <w:p>
       <w:pPr>
         <w:pStyle w:val="Bibliography"/>
@@ -2148,8 +2102,8 @@
         <w:t xml:space="preserve">(pp. 97–135). John Benjamins Publishing Company.</w:t>
       </w:r>
     </w:p>
-    <w:bookmarkEnd w:id="60"/>
-    <w:bookmarkStart w:id="61" w:name="ref-liu2018review"/>
+    <w:bookmarkEnd w:id="59"/>
+    <w:bookmarkStart w:id="60" w:name="ref-liu2018review"/>
     <w:p>
       <w:pPr>
         <w:pStyle w:val="Bibliography"/>
@@ -2184,14 +2138,14 @@
         <w:t xml:space="preserve">(4), 1024–1044.</w:t>
       </w:r>
     </w:p>
-    <w:bookmarkEnd w:id="61"/>
-    <w:bookmarkStart w:id="62" w:name="ref-nencheva2021moment"/>
+    <w:bookmarkEnd w:id="60"/>
+    <w:bookmarkStart w:id="62" w:name="ref-maris2007nonparametric"/>
     <w:p>
       <w:pPr>
         <w:pStyle w:val="Bibliography"/>
       </w:pPr>
       <w:r>
-        <w:t xml:space="preserve">Nencheva, M. L., Piazza, E. A., &amp; Lew-Williams, C. (2021). The moment-to-moment pitch dynamics of child-directed speech shape toddlers’ attention and learning.</w:t>
+        <w:t xml:space="preserve">Maris, E., &amp; Oostenveld, R. (2007). Nonparametric statistical testing of EEG-and MEG-data.</w:t>
       </w:r>
       <w:r>
         <w:t xml:space="preserve"> </w:t>
@@ -2201,7 +2155,7 @@
           <w:i/>
           <w:iCs/>
         </w:rPr>
-        <w:t xml:space="preserve">Developmental Science</w:t>
+        <w:t xml:space="preserve">Journal of Neuroscience Methods</w:t>
       </w:r>
       <w:r>
         <w:t xml:space="preserve">,</w:t>
@@ -2214,11 +2168,22 @@
           <w:i/>
           <w:iCs/>
         </w:rPr>
-        <w:t xml:space="preserve">24</w:t>
-      </w:r>
-      <w:r>
-        <w:t xml:space="preserve">(1), e12997.</w:t>
-      </w:r>
+        <w:t xml:space="preserve">164</w:t>
+      </w:r>
+      <w:r>
+        <w:t xml:space="preserve">(1), 177–190.</w:t>
+      </w:r>
+      <w:r>
+        <w:t xml:space="preserve"> </w:t>
+      </w:r>
+      <w:hyperlink r:id="rId61">
+        <w:r>
+          <w:rPr>
+            <w:rStyle w:val="Hyperlink"/>
+          </w:rPr>
+          <w:t xml:space="preserve">https://doi.org/10.1016/j.jneumeth.2007.03.024</w:t>
+        </w:r>
+      </w:hyperlink>
     </w:p>
     <w:bookmarkEnd w:id="62"/>
     <w:bookmarkStart w:id="64" w:name="ref-rstan"/>
@@ -2304,13 +2269,13 @@
       </w:hyperlink>
     </w:p>
     <w:bookmarkEnd w:id="64"/>
-    <w:bookmarkStart w:id="65" w:name="ref-tormene2009matching"/>
+    <w:bookmarkStart w:id="66" w:name="ref-loo"/>
     <w:p>
       <w:pPr>
         <w:pStyle w:val="Bibliography"/>
       </w:pPr>
       <w:r>
-        <w:t xml:space="preserve">Tormene, P., Giorgino, T., Quaglini, S., &amp; Stefanelli, M. (2009). Matching incomplete time series with dynamic time warping: An algorithm and an application to post-stroke rehabilitation.</w:t>
+        <w:t xml:space="preserve">Yao, Y., Vehtari, A., Simpson, D., &amp; Gelman, A. (2017). Using stacking to average bayesian predictive distributions.</w:t>
       </w:r>
       <w:r>
         <w:t xml:space="preserve"> </w:t>
@@ -2320,42 +2285,6 @@
           <w:i/>
           <w:iCs/>
         </w:rPr>
-        <w:t xml:space="preserve">Artificial Intelligence in Medicine</w:t>
-      </w:r>
-      <w:r>
-        <w:t xml:space="preserve">,</w:t>
-      </w:r>
-      <w:r>
-        <w:t xml:space="preserve"> </w:t>
-      </w:r>
-      <w:r>
-        <w:rPr>
-          <w:i/>
-          <w:iCs/>
-        </w:rPr>
-        <w:t xml:space="preserve">45</w:t>
-      </w:r>
-      <w:r>
-        <w:t xml:space="preserve">(1), 11–34.</w:t>
-      </w:r>
-    </w:p>
-    <w:bookmarkEnd w:id="65"/>
-    <w:bookmarkStart w:id="67" w:name="ref-loo"/>
-    <w:p>
-      <w:pPr>
-        <w:pStyle w:val="Bibliography"/>
-      </w:pPr>
-      <w:r>
-        <w:t xml:space="preserve">Yao, Y., Vehtari, A., Simpson, D., &amp; Gelman, A. (2017). Using stacking to average bayesian predictive distributions.</w:t>
-      </w:r>
-      <w:r>
-        <w:t xml:space="preserve"> </w:t>
-      </w:r>
-      <w:r>
-        <w:rPr>
-          <w:i/>
-          <w:iCs/>
-        </w:rPr>
         <w:t xml:space="preserve">Bayesian Analysis</w:t>
       </w:r>
       <w:r>
@@ -2364,7 +2293,7 @@
       <w:r>
         <w:t xml:space="preserve"> </w:t>
       </w:r>
-      <w:hyperlink r:id="rId66">
+      <w:hyperlink r:id="rId65">
         <w:r>
           <w:rPr>
             <w:rStyle w:val="Hyperlink"/>
@@ -2373,11 +2302,9 @@
         </w:r>
       </w:hyperlink>
     </w:p>
+    <w:bookmarkEnd w:id="66"/>
     <w:bookmarkEnd w:id="67"/>
     <w:bookmarkEnd w:id="68"/>
-    <w:bookmarkEnd w:id="69"/>
-    <w:bookmarkEnd w:id="70"/>
-    <w:bookmarkEnd w:id="71"/>
     <w:sectPr>
       <w:headerReference r:id="rId9" w:type="even"/>
       <w:headerReference r:id="rId11" w:type="default"/>

</xml_diff>

<commit_message>
update refs + small stats formatting fixes
</commit_message>
<xml_diff>
--- a/LexVar-SM.docx
+++ b/LexVar-SM.docx
@@ -1756,7 +1756,17 @@
         <w:pStyle w:val="BodyText"/>
       </w:pPr>
       <w:r>
-        <w:t xml:space="preserve">A one-way ANOVA revealed a significant main effect of condition on pupil size synchrony [F(2, 283) = 20.96,</w:t>
+        <w:t xml:space="preserve">A one-way ANOVA revealed a significant main effect of condition on pupil size synchrony [</w:t>
+      </w:r>
+      <w:r>
+        <w:rPr>
+          <w:i/>
+          <w:iCs/>
+        </w:rPr>
+        <w:t xml:space="preserve">F</w:t>
+      </w:r>
+      <w:r>
+        <w:t xml:space="preserve">(2, 283) = 20.96,</w:t>
       </w:r>
       <w:r>
         <w:t xml:space="preserve"> </w:t>
@@ -1788,7 +1798,23 @@
         <w:t xml:space="preserve"> </w:t>
       </w:r>
       <w:r>
-        <w:t xml:space="preserve">&lt; 0.001, Cohen’s d = 0.83) and atypical variation conditions (ΔM = 0.53,</w:t>
+        <w:t xml:space="preserve">&lt; 0.001, Cohen’s</w:t>
+      </w:r>
+      <w:r>
+        <w:t xml:space="preserve"> </w:t>
+      </w:r>
+      <w:r>
+        <w:rPr>
+          <w:i/>
+          <w:iCs/>
+        </w:rPr>
+        <w:t xml:space="preserve">d</w:t>
+      </w:r>
+      <w:r>
+        <w:t xml:space="preserve"> </w:t>
+      </w:r>
+      <w:r>
+        <w:t xml:space="preserve">= 0.83) and atypical variation conditions (ΔM = 0.53,</w:t>
       </w:r>
       <w:r>
         <w:t xml:space="preserve"> </w:t>
@@ -1804,7 +1830,23 @@
         <w:t xml:space="preserve"> </w:t>
       </w:r>
       <w:r>
-        <w:t xml:space="preserve">&lt; 0.001, Cohen’s d = 0.64;</w:t>
+        <w:t xml:space="preserve">&lt; 0.001, Cohen’s</w:t>
+      </w:r>
+      <w:r>
+        <w:t xml:space="preserve"> </w:t>
+      </w:r>
+      <w:r>
+        <w:rPr>
+          <w:i/>
+          <w:iCs/>
+        </w:rPr>
+        <w:t xml:space="preserve">d</w:t>
+      </w:r>
+      <w:r>
+        <w:t xml:space="preserve"> </w:t>
+      </w:r>
+      <w:r>
+        <w:t xml:space="preserve">= 0.64;</w:t>
       </w:r>
       <w:r>
         <w:t xml:space="preserve"> </w:t>
@@ -2052,7 +2094,7 @@
       </w:r>
     </w:p>
     <w:bookmarkEnd w:id="54"/>
-    <w:bookmarkStart w:id="68" w:name="references"/>
+    <w:bookmarkStart w:id="72" w:name="references"/>
     <w:p>
       <w:pPr>
         <w:pStyle w:val="Heading1"/>
@@ -2061,7 +2103,7 @@
         <w:t xml:space="preserve">4. References</w:t>
       </w:r>
     </w:p>
-    <w:bookmarkStart w:id="67" w:name="refs"/>
+    <w:bookmarkStart w:id="71" w:name="refs"/>
     <w:bookmarkStart w:id="56" w:name="ref-lme4"/>
     <w:p>
       <w:pPr>
@@ -2118,13 +2160,52 @@
       </w:hyperlink>
     </w:p>
     <w:bookmarkEnd w:id="56"/>
-    <w:bookmarkStart w:id="57" w:name="ref-brms"/>
+    <w:bookmarkStart w:id="58" w:name="ref-brms"/>
     <w:p>
       <w:pPr>
         <w:pStyle w:val="Bibliography"/>
       </w:pPr>
       <w:r>
-        <w:t xml:space="preserve">Bürkner, P.-C. (2017). Brms: An r package for bayesian multilevel models using stan.</w:t>
+        <w:t xml:space="preserve">Bürkner, P.-C. (2017).</w:t>
+      </w:r>
+      <w:r>
+        <w:t xml:space="preserve"> </w:t>
+      </w:r>
+      <w:r>
+        <w:t xml:space="preserve">brms</w:t>
+      </w:r>
+      <w:r>
+        <w:t xml:space="preserve">: An</w:t>
+      </w:r>
+      <w:r>
+        <w:t xml:space="preserve"> </w:t>
+      </w:r>
+      <w:r>
+        <w:t xml:space="preserve">R</w:t>
+      </w:r>
+      <w:r>
+        <w:t xml:space="preserve"> </w:t>
+      </w:r>
+      <w:r>
+        <w:t xml:space="preserve">package for</w:t>
+      </w:r>
+      <w:r>
+        <w:t xml:space="preserve"> </w:t>
+      </w:r>
+      <w:r>
+        <w:t xml:space="preserve">B</w:t>
+      </w:r>
+      <w:r>
+        <w:t xml:space="preserve">ayesian multilevel models using</w:t>
+      </w:r>
+      <w:r>
+        <w:t xml:space="preserve"> </w:t>
+      </w:r>
+      <w:r>
+        <w:t xml:space="preserve">S</w:t>
+      </w:r>
+      <w:r>
+        <w:t xml:space="preserve">tan.</w:t>
       </w:r>
       <w:r>
         <w:t xml:space="preserve"> </w:t>
@@ -2150,17 +2231,37 @@
         <w:t xml:space="preserve">80</w:t>
       </w:r>
       <w:r>
-        <w:t xml:space="preserve">, 1–28.</w:t>
-      </w:r>
-    </w:p>
-    <w:bookmarkEnd w:id="57"/>
-    <w:bookmarkStart w:id="58" w:name="ref-cribari2010beta"/>
+        <w:t xml:space="preserve">(1), 1–28.</w:t>
+      </w:r>
+      <w:r>
+        <w:t xml:space="preserve"> </w:t>
+      </w:r>
+      <w:hyperlink r:id="rId57">
+        <w:r>
+          <w:rPr>
+            <w:rStyle w:val="Hyperlink"/>
+          </w:rPr>
+          <w:t xml:space="preserve">https://doi.org/10.18637/jss.v080.i01</w:t>
+        </w:r>
+      </w:hyperlink>
+    </w:p>
+    <w:bookmarkEnd w:id="58"/>
+    <w:bookmarkStart w:id="60" w:name="ref-cribari2010beta"/>
     <w:p>
       <w:pPr>
         <w:pStyle w:val="Bibliography"/>
       </w:pPr>
       <w:r>
-        <w:t xml:space="preserve">Cribari-Neto, F., &amp; Zeileis, A. (2010). Beta regression in r.</w:t>
+        <w:t xml:space="preserve">Cribari-Neto, F., &amp; Zeileis, A. (2010). Beta regression in</w:t>
+      </w:r>
+      <w:r>
+        <w:t xml:space="preserve"> </w:t>
+      </w:r>
+      <w:r>
+        <w:t xml:space="preserve">R</w:t>
+      </w:r>
+      <w:r>
+        <w:t xml:space="preserve">.</w:t>
       </w:r>
       <w:r>
         <w:t xml:space="preserve"> </w:t>
@@ -2188,9 +2289,20 @@
       <w:r>
         <w:t xml:space="preserve">(1), 1–24.</w:t>
       </w:r>
-    </w:p>
-    <w:bookmarkEnd w:id="58"/>
-    <w:bookmarkStart w:id="59" w:name="ref-fernald2008looking"/>
+      <w:r>
+        <w:t xml:space="preserve"> </w:t>
+      </w:r>
+      <w:hyperlink r:id="rId59">
+        <w:r>
+          <w:rPr>
+            <w:rStyle w:val="Hyperlink"/>
+          </w:rPr>
+          <w:t xml:space="preserve">https://doi.org/10.18637/jss.v034.i02</w:t>
+        </w:r>
+      </w:hyperlink>
+    </w:p>
+    <w:bookmarkEnd w:id="60"/>
+    <w:bookmarkStart w:id="62" w:name="ref-fernald2008looking"/>
     <w:p>
       <w:pPr>
         <w:pStyle w:val="Bibliography"/>
@@ -2214,15 +2326,35 @@
       <w:r>
         <w:t xml:space="preserve">(pp. 97–135). John Benjamins Publishing Company.</w:t>
       </w:r>
-    </w:p>
-    <w:bookmarkEnd w:id="59"/>
-    <w:bookmarkStart w:id="60" w:name="ref-liu2018review"/>
+      <w:r>
+        <w:t xml:space="preserve"> </w:t>
+      </w:r>
+      <w:hyperlink r:id="rId61">
+        <w:r>
+          <w:rPr>
+            <w:rStyle w:val="Hyperlink"/>
+          </w:rPr>
+          <w:t xml:space="preserve">https://doi.org/10.1075/lald.44.06fer</w:t>
+        </w:r>
+      </w:hyperlink>
+    </w:p>
+    <w:bookmarkEnd w:id="62"/>
+    <w:bookmarkStart w:id="64" w:name="ref-liu2018review"/>
     <w:p>
       <w:pPr>
         <w:pStyle w:val="Bibliography"/>
       </w:pPr>
       <w:r>
-        <w:t xml:space="preserve">Liu, F., &amp; Eugenio, E. C. (2018). A review and comparison of bayesian and likelihood-based inferences in beta regression and zero-or-one-inflated beta regression.</w:t>
+        <w:t xml:space="preserve">Liu, F., &amp; Eugenio, E. C. (2018). A review and comparison of</w:t>
+      </w:r>
+      <w:r>
+        <w:t xml:space="preserve"> </w:t>
+      </w:r>
+      <w:r>
+        <w:t xml:space="preserve">B</w:t>
+      </w:r>
+      <w:r>
+        <w:t xml:space="preserve">ayesian and likelihood-based inferences in beta regression and zero-or-one-inflated beta regression.</w:t>
       </w:r>
       <w:r>
         <w:t xml:space="preserve"> </w:t>
@@ -2250,15 +2382,44 @@
       <w:r>
         <w:t xml:space="preserve">(4), 1024–1044.</w:t>
       </w:r>
-    </w:p>
-    <w:bookmarkEnd w:id="60"/>
-    <w:bookmarkStart w:id="62" w:name="ref-maris2007nonparametric"/>
+      <w:r>
+        <w:t xml:space="preserve"> </w:t>
+      </w:r>
+      <w:hyperlink r:id="rId63">
+        <w:r>
+          <w:rPr>
+            <w:rStyle w:val="Hyperlink"/>
+          </w:rPr>
+          <w:t xml:space="preserve">https://doi.org/10.1177/0962280216650699</w:t>
+        </w:r>
+      </w:hyperlink>
+    </w:p>
+    <w:bookmarkEnd w:id="64"/>
+    <w:bookmarkStart w:id="66" w:name="ref-maris2007nonparametric"/>
     <w:p>
       <w:pPr>
         <w:pStyle w:val="Bibliography"/>
       </w:pPr>
       <w:r>
-        <w:t xml:space="preserve">Maris, E., &amp; Oostenveld, R. (2007). Nonparametric statistical testing of EEG-and MEG-data.</w:t>
+        <w:t xml:space="preserve">Maris, E., &amp; Oostenveld, R. (2007). Nonparametric statistical testing of</w:t>
+      </w:r>
+      <w:r>
+        <w:t xml:space="preserve"> </w:t>
+      </w:r>
+      <w:r>
+        <w:t xml:space="preserve">EEG</w:t>
+      </w:r>
+      <w:r>
+        <w:t xml:space="preserve">- and</w:t>
+      </w:r>
+      <w:r>
+        <w:t xml:space="preserve"> </w:t>
+      </w:r>
+      <w:r>
+        <w:t xml:space="preserve">MEG</w:t>
+      </w:r>
+      <w:r>
+        <w:t xml:space="preserve">-data.</w:t>
       </w:r>
       <w:r>
         <w:t xml:space="preserve"> </w:t>
@@ -2289,7 +2450,7 @@
       <w:r>
         <w:t xml:space="preserve"> </w:t>
       </w:r>
-      <w:hyperlink r:id="rId61">
+      <w:hyperlink r:id="rId65">
         <w:r>
           <w:rPr>
             <w:rStyle w:val="Hyperlink"/>
@@ -2298,8 +2459,8 @@
         </w:r>
       </w:hyperlink>
     </w:p>
-    <w:bookmarkEnd w:id="62"/>
-    <w:bookmarkStart w:id="64" w:name="ref-rstan"/>
+    <w:bookmarkEnd w:id="66"/>
+    <w:bookmarkStart w:id="68" w:name="ref-rstan"/>
     <w:p>
       <w:pPr>
         <w:pStyle w:val="Bibliography"/>
@@ -2372,7 +2533,7 @@
       <w:r>
         <w:t xml:space="preserve"> </w:t>
       </w:r>
-      <w:hyperlink r:id="rId63">
+      <w:hyperlink r:id="rId67">
         <w:r>
           <w:rPr>
             <w:rStyle w:val="Hyperlink"/>
@@ -2381,14 +2542,23 @@
         </w:r>
       </w:hyperlink>
     </w:p>
-    <w:bookmarkEnd w:id="64"/>
-    <w:bookmarkStart w:id="66" w:name="ref-loo"/>
+    <w:bookmarkEnd w:id="68"/>
+    <w:bookmarkStart w:id="70" w:name="ref-loo"/>
     <w:p>
       <w:pPr>
         <w:pStyle w:val="Bibliography"/>
       </w:pPr>
       <w:r>
-        <w:t xml:space="preserve">Yao, Y., Vehtari, A., Simpson, D., &amp; Gelman, A. (2017). Using stacking to average bayesian predictive distributions.</w:t>
+        <w:t xml:space="preserve">Yao, Y., Vehtari, A., Simpson, D., &amp; Gelman, A. (2017). Using stacking to average</w:t>
+      </w:r>
+      <w:r>
+        <w:t xml:space="preserve"> </w:t>
+      </w:r>
+      <w:r>
+        <w:t xml:space="preserve">B</w:t>
+      </w:r>
+      <w:r>
+        <w:t xml:space="preserve">ayesian predictive distributions.</w:t>
       </w:r>
       <w:r>
         <w:t xml:space="preserve"> </w:t>
@@ -2406,7 +2576,7 @@
       <w:r>
         <w:t xml:space="preserve"> </w:t>
       </w:r>
-      <w:hyperlink r:id="rId65">
+      <w:hyperlink r:id="rId69">
         <w:r>
           <w:rPr>
             <w:rStyle w:val="Hyperlink"/>
@@ -2415,9 +2585,9 @@
         </w:r>
       </w:hyperlink>
     </w:p>
-    <w:bookmarkEnd w:id="66"/>
-    <w:bookmarkEnd w:id="67"/>
-    <w:bookmarkEnd w:id="68"/>
+    <w:bookmarkEnd w:id="70"/>
+    <w:bookmarkEnd w:id="71"/>
+    <w:bookmarkEnd w:id="72"/>
     <w:sectPr>
       <w:headerReference r:id="rId9" w:type="even"/>
       <w:headerReference r:id="rId11" w:type="default"/>

</xml_diff>